<commit_message>
Added Raycasting Hit Object Detection and modified Docs
</commit_message>
<xml_diff>
--- a/Project Docs.docx
+++ b/Project Docs.docx
@@ -3,13 +3,49 @@
 <w:document xmlns:wpc="http://schemas.microsoft.com/office/word/2010/wordprocessingCanvas" xmlns:cx="http://schemas.microsoft.com/office/drawing/2014/chartex" xmlns:cx1="http://schemas.microsoft.com/office/drawing/2015/9/8/chartex" xmlns:cx2="http://schemas.microsoft.com/office/drawing/2015/10/21/chartex" xmlns:cx3="http://schemas.microsoft.com/office/drawing/2016/5/9/chartex" xmlns:cx4="http://schemas.microsoft.com/office/drawing/2016/5/10/chartex" xmlns:cx5="http://schemas.microsoft.com/office/drawing/2016/5/11/chartex" xmlns:cx6="http://schemas.microsoft.com/office/drawing/2016/5/12/chartex" xmlns:cx7="http://schemas.microsoft.com/office/drawing/2016/5/13/chartex" xmlns:cx8="http://schemas.microsoft.com/office/drawing/2016/5/14/chartex" xmlns:mc="http://schemas.openxmlformats.org/markup-compatibility/2006" xmlns:aink="http://schemas.microsoft.com/office/drawing/2016/ink" xmlns:am3d="http://schemas.microsoft.com/office/drawing/2017/model3d" xmlns:o="urn:schemas-microsoft-com:office:office" xmlns:oel="http://schemas.microsoft.com/office/2019/extlst" xmlns:r="http://schemas.openxmlformats.org/officeDocument/2006/relationships" xmlns:m="http://schemas.openxmlformats.org/officeDocument/2006/math" xmlns:v="urn:schemas-microsoft-com:vml" xmlns:wp14="http://schemas.microsoft.com/office/word/2010/wordprocessingDrawing" xmlns:wp="http://schemas.openxmlformats.org/drawingml/2006/wordprocessingDrawing" xmlns:w10="urn:schemas-microsoft-com:office:word" xmlns:w="http://schemas.openxmlformats.org/wordprocessingml/2006/main" xmlns:w14="http://schemas.microsoft.com/office/word/2010/wordml" xmlns:w15="http://schemas.microsoft.com/office/word/2012/wordml" xmlns:w16cex="http://schemas.microsoft.com/office/word/2018/wordml/cex" xmlns:w16cid="http://schemas.microsoft.com/office/word/2016/wordml/cid" xmlns:w16="http://schemas.microsoft.com/office/word/2018/wordml" xmlns:w16du="http://schemas.microsoft.com/office/word/2023/wordml/word16du" xmlns:w16sdtdh="http://schemas.microsoft.com/office/word/2020/wordml/sdtdatahash" xmlns:w16sdtfl="http://schemas.microsoft.com/office/word/2024/wordml/sdtformatlock" xmlns:w16se="http://schemas.microsoft.com/office/word/2015/wordml/symex" xmlns:wpg="http://schemas.microsoft.com/office/word/2010/wordprocessingGroup" xmlns:wpi="http://schemas.microsoft.com/office/word/2010/wordprocessingInk" xmlns:wne="http://schemas.microsoft.com/office/word/2006/wordml" xmlns:wps="http://schemas.microsoft.com/office/word/2010/wordprocessingShape" mc:Ignorable="w14 w15 w16se w16cid w16 w16cex w16sdtdh w16sdtfl w16du wp14">
   <w:body>
     <w:p>
-      <w:r>
+      <w:pPr>
+        <w:rPr>
+          <w:b/>
+          <w:bCs/>
+          <w:sz w:val="36"/>
+          <w:szCs w:val="36"/>
+          <w:u w:val="single"/>
+        </w:rPr>
+      </w:pPr>
+      <w:r>
+        <w:rPr>
+          <w:b/>
+          <w:bCs/>
+          <w:sz w:val="36"/>
+          <w:szCs w:val="36"/>
+          <w:u w:val="single"/>
+        </w:rPr>
         <w:t>Welcome to the HG-JM-Unit-1-Game wiki!</w:t>
       </w:r>
     </w:p>
     <w:p>
-      <w:r>
-        <w:t>initial ideas:</w:t>
+      <w:pPr>
+        <w:rPr>
+          <w:sz w:val="28"/>
+          <w:szCs w:val="28"/>
+          <w:u w:val="single"/>
+        </w:rPr>
+      </w:pPr>
+      <w:r>
+        <w:rPr>
+          <w:sz w:val="28"/>
+          <w:szCs w:val="28"/>
+          <w:u w:val="single"/>
+        </w:rPr>
+        <w:t>I</w:t>
+      </w:r>
+      <w:r>
+        <w:rPr>
+          <w:sz w:val="28"/>
+          <w:szCs w:val="28"/>
+          <w:u w:val="single"/>
+        </w:rPr>
+        <w:t>nitial ideas:</w:t>
       </w:r>
     </w:p>
     <w:p>
@@ -17,86 +53,138 @@
         <w:t>duck shooter fairground style game</w:t>
       </w:r>
     </w:p>
+    <w:p/>
     <w:p>
-      <w:r>
+      <w:pPr>
+        <w:rPr>
+          <w:sz w:val="28"/>
+          <w:szCs w:val="28"/>
+          <w:u w:val="single"/>
+        </w:rPr>
+      </w:pPr>
+      <w:r>
+        <w:rPr>
+          <w:sz w:val="28"/>
+          <w:szCs w:val="28"/>
+          <w:u w:val="single"/>
+        </w:rPr>
         <w:t>minimum requirements:</w:t>
       </w:r>
     </w:p>
     <w:p>
-      <w:pPr>
+      <w:r>
+        <w:t>A game executable developed in Unity featuring</w:t>
+      </w:r>
+    </w:p>
+    <w:p>
+      <w:pPr>
+        <w:pStyle w:val="ListParagraph"/>
         <w:numPr>
           <w:ilvl w:val="0"/>
-          <w:numId w:val="1"/>
+          <w:numId w:val="3"/>
         </w:numPr>
       </w:pPr>
       <w:r>
-        <w:t>A game executable developed in Unity featuring</w:t>
+        <w:t>Scripting in C#</w:t>
       </w:r>
     </w:p>
     <w:p>
-      <w:r>
-        <w:t>o Scripting in C#</w:t>
+      <w:pPr>
+        <w:pStyle w:val="ListParagraph"/>
+        <w:numPr>
+          <w:ilvl w:val="0"/>
+          <w:numId w:val="3"/>
+        </w:numPr>
+      </w:pPr>
+      <w:r>
+        <w:t>User input through keyboard or controller</w:t>
       </w:r>
     </w:p>
     <w:p>
-      <w:r>
-        <w:t>o User input through keyboard or controller</w:t>
+      <w:pPr>
+        <w:pStyle w:val="ListParagraph"/>
+        <w:numPr>
+          <w:ilvl w:val="0"/>
+          <w:numId w:val="3"/>
+        </w:numPr>
+      </w:pPr>
+      <w:r>
+        <w:t>At least one object that the player has control over</w:t>
       </w:r>
     </w:p>
     <w:p>
-      <w:r>
-        <w:t>o At least one object that the player has control over</w:t>
+      <w:pPr>
+        <w:pStyle w:val="ListParagraph"/>
+        <w:numPr>
+          <w:ilvl w:val="0"/>
+          <w:numId w:val="3"/>
+        </w:numPr>
+      </w:pPr>
+      <w:r>
+        <w:t>At least two objects that can interact with each other</w:t>
       </w:r>
     </w:p>
     <w:p>
-      <w:r>
-        <w:t>o At least two objects that can interact with each other</w:t>
+      <w:pPr>
+        <w:pStyle w:val="ListParagraph"/>
+        <w:numPr>
+          <w:ilvl w:val="1"/>
+          <w:numId w:val="3"/>
+        </w:numPr>
+      </w:pPr>
+      <w:r>
+        <w:t>o</w:t>
+      </w:r>
+      <w:r>
+        <w:t>ne of these might be the player-controlled object</w:t>
       </w:r>
     </w:p>
     <w:p>
-      <w:r>
-        <w:sym w:font="Symbol" w:char="F0A7"/>
-      </w:r>
-      <w:r>
-        <w:t xml:space="preserve"> One of these might be the player-controlled object</w:t>
+      <w:pPr>
+        <w:pStyle w:val="ListParagraph"/>
+        <w:numPr>
+          <w:ilvl w:val="0"/>
+          <w:numId w:val="3"/>
+        </w:numPr>
+      </w:pPr>
+      <w:r>
+        <w:t>At least one object that is primarily driven through the physics system (2D or 3D)</w:t>
       </w:r>
     </w:p>
     <w:p>
-      <w:r>
-        <w:t>o At least one object that is primarily driven through the physics system (2D or 3D)</w:t>
+      <w:pPr>
+        <w:pStyle w:val="ListParagraph"/>
+        <w:numPr>
+          <w:ilvl w:val="1"/>
+          <w:numId w:val="3"/>
+        </w:numPr>
+      </w:pPr>
+      <w:r>
+        <w:t>This may also be the player-controlled object</w:t>
       </w:r>
     </w:p>
     <w:p>
-      <w:r>
-        <w:sym w:font="Symbol" w:char="F0A7"/>
-      </w:r>
-      <w:r>
-        <w:t xml:space="preserve"> This may also be the player-controlled object</w:t>
-      </w:r>
-    </w:p>
-    <w:p>
-      <w:r>
-        <w:t>o At least one imported asset</w:t>
-      </w:r>
-    </w:p>
-    <w:p>
-      <w:pPr>
+      <w:pPr>
+        <w:pStyle w:val="ListParagraph"/>
         <w:numPr>
           <w:ilvl w:val="0"/>
           <w:numId w:val="2"/>
         </w:numPr>
       </w:pPr>
       <w:r>
-        <w:t>An established use of Version Control (likely git)</w:t>
+        <w:t>At least one imported asset</w:t>
       </w:r>
     </w:p>
     <w:p>
-      <w:pPr>
-        <w:numPr>
-          <w:ilvl w:val="0"/>
-          <w:numId w:val="2"/>
-        </w:numPr>
-      </w:pPr>
+      <w:r>
+        <w:t>An</w:t>
+      </w:r>
+      <w:r>
+        <w:t xml:space="preserve"> established use of Version Control (likely git)</w:t>
+      </w:r>
+    </w:p>
+    <w:p/>
+    <w:p>
       <w:r>
         <w:t>Supporting documentation (see the brief)</w:t>
       </w:r>
@@ -314,6 +402,118 @@
     </w:lvl>
   </w:abstractNum>
   <w:abstractNum w:abstractNumId="1" w15:restartNumberingAfterBreak="0">
+    <w:nsid w:val="641E24A8"/>
+    <w:multiLevelType w:val="hybridMultilevel"/>
+    <w:tmpl w:val="A1189240"/>
+    <w:lvl w:ilvl="0" w:tplc="08090001">
+      <w:start w:val="1"/>
+      <w:numFmt w:val="bullet"/>
+      <w:lvlText w:val=""/>
+      <w:lvlJc w:val="left"/>
+      <w:pPr>
+        <w:ind w:left="720" w:hanging="360"/>
+      </w:pPr>
+      <w:rPr>
+        <w:rFonts w:ascii="Symbol" w:hAnsi="Symbol" w:hint="default"/>
+      </w:rPr>
+    </w:lvl>
+    <w:lvl w:ilvl="1" w:tplc="359059B8">
+      <w:numFmt w:val="bullet"/>
+      <w:lvlText w:val=""/>
+      <w:lvlJc w:val="left"/>
+      <w:pPr>
+        <w:ind w:left="1440" w:hanging="360"/>
+      </w:pPr>
+      <w:rPr>
+        <w:rFonts w:ascii="Symbol" w:eastAsiaTheme="minorHAnsi" w:hAnsi="Symbol" w:cstheme="minorBidi" w:hint="default"/>
+      </w:rPr>
+    </w:lvl>
+    <w:lvl w:ilvl="2" w:tplc="08090005" w:tentative="1">
+      <w:start w:val="1"/>
+      <w:numFmt w:val="bullet"/>
+      <w:lvlText w:val=""/>
+      <w:lvlJc w:val="left"/>
+      <w:pPr>
+        <w:ind w:left="2160" w:hanging="360"/>
+      </w:pPr>
+      <w:rPr>
+        <w:rFonts w:ascii="Wingdings" w:hAnsi="Wingdings" w:hint="default"/>
+      </w:rPr>
+    </w:lvl>
+    <w:lvl w:ilvl="3" w:tplc="08090001" w:tentative="1">
+      <w:start w:val="1"/>
+      <w:numFmt w:val="bullet"/>
+      <w:lvlText w:val=""/>
+      <w:lvlJc w:val="left"/>
+      <w:pPr>
+        <w:ind w:left="2880" w:hanging="360"/>
+      </w:pPr>
+      <w:rPr>
+        <w:rFonts w:ascii="Symbol" w:hAnsi="Symbol" w:hint="default"/>
+      </w:rPr>
+    </w:lvl>
+    <w:lvl w:ilvl="4" w:tplc="08090003" w:tentative="1">
+      <w:start w:val="1"/>
+      <w:numFmt w:val="bullet"/>
+      <w:lvlText w:val="o"/>
+      <w:lvlJc w:val="left"/>
+      <w:pPr>
+        <w:ind w:left="3600" w:hanging="360"/>
+      </w:pPr>
+      <w:rPr>
+        <w:rFonts w:ascii="Courier New" w:hAnsi="Courier New" w:cs="Courier New" w:hint="default"/>
+      </w:rPr>
+    </w:lvl>
+    <w:lvl w:ilvl="5" w:tplc="08090005" w:tentative="1">
+      <w:start w:val="1"/>
+      <w:numFmt w:val="bullet"/>
+      <w:lvlText w:val=""/>
+      <w:lvlJc w:val="left"/>
+      <w:pPr>
+        <w:ind w:left="4320" w:hanging="360"/>
+      </w:pPr>
+      <w:rPr>
+        <w:rFonts w:ascii="Wingdings" w:hAnsi="Wingdings" w:hint="default"/>
+      </w:rPr>
+    </w:lvl>
+    <w:lvl w:ilvl="6" w:tplc="08090001" w:tentative="1">
+      <w:start w:val="1"/>
+      <w:numFmt w:val="bullet"/>
+      <w:lvlText w:val=""/>
+      <w:lvlJc w:val="left"/>
+      <w:pPr>
+        <w:ind w:left="5040" w:hanging="360"/>
+      </w:pPr>
+      <w:rPr>
+        <w:rFonts w:ascii="Symbol" w:hAnsi="Symbol" w:hint="default"/>
+      </w:rPr>
+    </w:lvl>
+    <w:lvl w:ilvl="7" w:tplc="08090003" w:tentative="1">
+      <w:start w:val="1"/>
+      <w:numFmt w:val="bullet"/>
+      <w:lvlText w:val="o"/>
+      <w:lvlJc w:val="left"/>
+      <w:pPr>
+        <w:ind w:left="5760" w:hanging="360"/>
+      </w:pPr>
+      <w:rPr>
+        <w:rFonts w:ascii="Courier New" w:hAnsi="Courier New" w:cs="Courier New" w:hint="default"/>
+      </w:rPr>
+    </w:lvl>
+    <w:lvl w:ilvl="8" w:tplc="08090005" w:tentative="1">
+      <w:start w:val="1"/>
+      <w:numFmt w:val="bullet"/>
+      <w:lvlText w:val=""/>
+      <w:lvlJc w:val="left"/>
+      <w:pPr>
+        <w:ind w:left="6480" w:hanging="360"/>
+      </w:pPr>
+      <w:rPr>
+        <w:rFonts w:ascii="Wingdings" w:hAnsi="Wingdings" w:hint="default"/>
+      </w:rPr>
+    </w:lvl>
+  </w:abstractNum>
+  <w:abstractNum w:abstractNumId="2" w15:restartNumberingAfterBreak="0">
     <w:nsid w:val="675D39F9"/>
     <w:multiLevelType w:val="multilevel"/>
     <w:tmpl w:val="8BACD394"/>
@@ -463,10 +663,13 @@
     </w:lvl>
   </w:abstractNum>
   <w:num w:numId="1" w16cid:durableId="990252941">
-    <w:abstractNumId w:val="1"/>
+    <w:abstractNumId w:val="2"/>
   </w:num>
   <w:num w:numId="2" w16cid:durableId="588732970">
     <w:abstractNumId w:val="0"/>
+  </w:num>
+  <w:num w:numId="3" w16cid:durableId="2080396923">
+    <w:abstractNumId w:val="1"/>
   </w:num>
 </w:numbering>
 </file>
@@ -1074,6 +1277,7 @@
   <w:style w:type="character" w:default="1" w:styleId="DefaultParagraphFont">
     <w:name w:val="Default Paragraph Font"/>
     <w:uiPriority w:val="1"/>
+    <w:semiHidden/>
     <w:unhideWhenUsed/>
   </w:style>
   <w:style w:type="table" w:default="1" w:styleId="TableNormal">

</xml_diff>